<commit_message>
Little By Little Game V1
</commit_message>
<xml_diff>
--- a/Overdachts.docx
+++ b/Overdachts.docx
@@ -926,17 +926,18 @@
         <w:rPr>
           <w:rStyle w:val="Heading2Char"/>
         </w:rPr>
-        <w:t>Diffuculty</w:t>
+        <w:t>Diff</w:t>
+      </w:r>
+      <w:r>
+        <w:rPr>
+          <w:rStyle w:val="Heading2Char"/>
+        </w:rPr>
+        <w:t>iculty</w:t>
       </w:r>
       <w:proofErr w:type="spellEnd"/>
     </w:p>
     <w:p>
       <w:pPr>
-        <w:rPr>
-          <w:lang w:val="en-US"/>
-        </w:rPr>
-      </w:pPr>
-      <w:r>
         <w:rPr>
           <w:rStyle w:val="Heading2Char"/>
           <w:rFonts w:asciiTheme="minorHAnsi" w:hAnsiTheme="minorHAnsi"/>
@@ -944,7 +945,154 @@
           <w:sz w:val="24"/>
           <w:szCs w:val="24"/>
         </w:rPr>
+      </w:pPr>
+      <w:r>
+        <w:rPr>
+          <w:rStyle w:val="Heading2Char"/>
+          <w:rFonts w:asciiTheme="minorHAnsi" w:hAnsiTheme="minorHAnsi"/>
+          <w:color w:val="auto"/>
+          <w:sz w:val="24"/>
+          <w:szCs w:val="24"/>
+        </w:rPr>
         <w:t>Dat je kan kiezen hoe lastig de level is</w:t>
+      </w:r>
+    </w:p>
+    <w:p>
+      <w:pPr>
+        <w:rPr>
+          <w:rStyle w:val="Heading2Char"/>
+          <w:rFonts w:asciiTheme="minorHAnsi" w:hAnsiTheme="minorHAnsi"/>
+          <w:color w:val="auto"/>
+          <w:sz w:val="24"/>
+          <w:szCs w:val="24"/>
+        </w:rPr>
+      </w:pPr>
+    </w:p>
+    <w:p>
+      <w:pPr>
+        <w:pStyle w:val="Heading2"/>
+        <w:rPr>
+          <w:rStyle w:val="Heading2Char"/>
+          <w:rFonts w:asciiTheme="minorHAnsi" w:hAnsiTheme="minorHAnsi"/>
+          <w:color w:val="auto"/>
+          <w:sz w:val="24"/>
+          <w:szCs w:val="24"/>
+        </w:rPr>
+      </w:pPr>
+      <w:r>
+        <w:rPr>
+          <w:rStyle w:val="Heading2Char"/>
+          <w:rFonts w:asciiTheme="minorHAnsi" w:hAnsiTheme="minorHAnsi"/>
+          <w:color w:val="auto"/>
+          <w:sz w:val="24"/>
+          <w:szCs w:val="24"/>
+        </w:rPr>
+        <w:t>Life</w:t>
+      </w:r>
+    </w:p>
+    <w:p>
+      <w:pPr>
+        <w:rPr>
+          <w:lang w:val="en-US"/>
+        </w:rPr>
+      </w:pPr>
+      <w:r>
+        <w:rPr>
+          <w:rStyle w:val="Heading2Char"/>
+          <w:rFonts w:asciiTheme="minorHAnsi" w:hAnsiTheme="minorHAnsi"/>
+          <w:color w:val="auto"/>
+          <w:sz w:val="24"/>
+          <w:szCs w:val="24"/>
+        </w:rPr>
+        <w:t xml:space="preserve">Je kan ook </w:t>
+      </w:r>
+      <w:proofErr w:type="spellStart"/>
+      <w:r>
+        <w:rPr>
+          <w:rStyle w:val="Heading2Char"/>
+          <w:rFonts w:asciiTheme="minorHAnsi" w:hAnsiTheme="minorHAnsi"/>
+          <w:color w:val="auto"/>
+          <w:sz w:val="24"/>
+          <w:szCs w:val="24"/>
+        </w:rPr>
+        <w:t>music</w:t>
+      </w:r>
+      <w:proofErr w:type="spellEnd"/>
+      <w:r>
+        <w:rPr>
+          <w:rStyle w:val="Heading2Char"/>
+          <w:rFonts w:asciiTheme="minorHAnsi" w:hAnsiTheme="minorHAnsi"/>
+          <w:color w:val="auto"/>
+          <w:sz w:val="24"/>
+          <w:szCs w:val="24"/>
+        </w:rPr>
+        <w:t xml:space="preserve">, sound effect </w:t>
+      </w:r>
+      <w:proofErr w:type="spellStart"/>
+      <w:r>
+        <w:rPr>
+          <w:rStyle w:val="Heading2Char"/>
+          <w:rFonts w:asciiTheme="minorHAnsi" w:hAnsiTheme="minorHAnsi"/>
+          <w:color w:val="auto"/>
+          <w:sz w:val="24"/>
+          <w:szCs w:val="24"/>
+        </w:rPr>
+        <w:t>and</w:t>
+      </w:r>
+      <w:proofErr w:type="spellEnd"/>
+      <w:r>
+        <w:rPr>
+          <w:rStyle w:val="Heading2Char"/>
+          <w:rFonts w:asciiTheme="minorHAnsi" w:hAnsiTheme="minorHAnsi"/>
+          <w:color w:val="auto"/>
+          <w:sz w:val="24"/>
+          <w:szCs w:val="24"/>
+        </w:rPr>
+        <w:t xml:space="preserve"> </w:t>
+      </w:r>
+      <w:proofErr w:type="spellStart"/>
+      <w:r>
+        <w:rPr>
+          <w:rStyle w:val="Heading2Char"/>
+          <w:rFonts w:asciiTheme="minorHAnsi" w:hAnsiTheme="minorHAnsi"/>
+          <w:color w:val="auto"/>
+          <w:sz w:val="24"/>
+          <w:szCs w:val="24"/>
+        </w:rPr>
+        <w:t>particate</w:t>
+      </w:r>
+      <w:proofErr w:type="spellEnd"/>
+      <w:r>
+        <w:rPr>
+          <w:rStyle w:val="Heading2Char"/>
+          <w:rFonts w:asciiTheme="minorHAnsi" w:hAnsiTheme="minorHAnsi"/>
+          <w:color w:val="auto"/>
+          <w:sz w:val="24"/>
+          <w:szCs w:val="24"/>
+        </w:rPr>
+        <w:t xml:space="preserve"> </w:t>
+      </w:r>
+      <w:proofErr w:type="spellStart"/>
+      <w:r>
+        <w:rPr>
+          <w:rStyle w:val="Heading2Char"/>
+          <w:rFonts w:asciiTheme="minorHAnsi" w:hAnsiTheme="minorHAnsi"/>
+          <w:color w:val="auto"/>
+          <w:sz w:val="24"/>
+          <w:szCs w:val="24"/>
+        </w:rPr>
+        <w:t>effects</w:t>
+      </w:r>
+      <w:proofErr w:type="spellEnd"/>
+      <w:r>
+        <w:rPr>
+          <w:rStyle w:val="Heading2Char"/>
+          <w:rFonts w:asciiTheme="minorHAnsi" w:hAnsiTheme="minorHAnsi"/>
+          <w:color w:val="auto"/>
+          <w:sz w:val="24"/>
+          <w:szCs w:val="24"/>
+        </w:rPr>
+        <w:t xml:space="preserve"> er aan toevoegen</w:t>
       </w:r>
     </w:p>
     <w:p>

</xml_diff>